<commit_message>
feat(analysis): LU-decomposition VLIW (832-bit) instruction compression study
- E0/E1/E2 striping comparison on 4 representative matrices (logical + strict-pow2 SRAM)
- E2-M4 (per-lane striping + derived 48b/cycle mask): 1.25-1.93x strict pow2, 1.33x unified pool
- hardware-faithful end-to-end decode verification (bit-exact, zero buffer underflow)
- lu/: LU instruction traces, generator sources, rebuilt canonical traces
- experiments/lu_*.py: analysis/verification scripts
- plan: LU analysis summary (2026-09-18) + FRV strategy/survey docs (2026-09-16)
- docs: update 新28nm综合结果.docx
</commit_message>
<xml_diff>
--- a/新28nm综合结果.docx
+++ b/新28nm综合结果.docx
@@ -1473,9 +1473,6 @@
           <w:p>
             <w:pPr>
               <w:spacing w:after="160" w:line="278" w:lineRule="auto"/>
-              <w:rPr>
-                <w:rFonts w:hint="eastAsia"/>
-              </w:rPr>
             </w:pPr>
             <w:r>
               <w:t>30,70</w:t>
@@ -1634,13 +1631,7 @@
         </w:tc>
       </w:tr>
     </w:tbl>
-    <w:p>
-      <w:pPr>
-        <w:rPr>
-          <w:rFonts w:hint="eastAsia"/>
-        </w:rPr>
-      </w:pPr>
-    </w:p>
+    <w:p/>
     <w:p>
       <w:pPr>
         <w:pStyle w:val="ui-markdownparagraph"/>
@@ -2231,9 +2222,6 @@
     <w:p>
       <w:pPr>
         <w:pStyle w:val="ui-markdownlist-item"/>
-        <w:rPr>
-          <w:rFonts w:hint="eastAsia"/>
-        </w:rPr>
       </w:pPr>
     </w:p>
     <w:tbl>
@@ -2645,13 +2633,7 @@
     </w:tbl>
     <w:p/>
     <w:p/>
-    <w:p>
-      <w:pPr>
-        <w:rPr>
-          <w:rFonts w:hint="eastAsia"/>
-        </w:rPr>
-      </w:pPr>
-    </w:p>
+    <w:p/>
     <w:p>
       <w:pPr>
         <w:rPr>
@@ -2969,11 +2951,6 @@
             <w:hideMark/>
           </w:tcPr>
           <w:p>
-            <w:pPr>
-              <w:rPr>
-                <w:rFonts w:hint="eastAsia"/>
-              </w:rPr>
-            </w:pPr>
             <w:r>
               <w:rPr>
                 <w:color w:val="EE0000"/>
@@ -3020,11 +2997,6 @@
             <w:hideMark/>
           </w:tcPr>
           <w:p>
-            <w:pPr>
-              <w:rPr>
-                <w:rFonts w:hint="eastAsia"/>
-              </w:rPr>
-            </w:pPr>
             <w:r>
               <w:rPr>
                 <w:rFonts w:hint="eastAsia"/>
@@ -3045,11 +3017,6 @@
             <w:hideMark/>
           </w:tcPr>
           <w:p>
-            <w:pPr>
-              <w:rPr>
-                <w:rFonts w:hint="eastAsia"/>
-              </w:rPr>
-            </w:pPr>
             <w:r>
               <w:rPr>
                 <w:rFonts w:hint="eastAsia"/>
@@ -3070,11 +3037,6 @@
             <w:hideMark/>
           </w:tcPr>
           <w:p>
-            <w:pPr>
-              <w:rPr>
-                <w:rFonts w:hint="eastAsia"/>
-              </w:rPr>
-            </w:pPr>
             <w:r>
               <w:t>0.0</w:t>
             </w:r>
@@ -3502,7 +3464,6 @@
           <w:p>
             <w:pPr>
               <w:rPr>
-                <w:rFonts w:hint="eastAsia"/>
                 <w:color w:val="EE0000"/>
               </w:rPr>
             </w:pPr>
@@ -3529,7 +3490,6 @@
           <w:p>
             <w:pPr>
               <w:rPr>
-                <w:rFonts w:hint="eastAsia"/>
                 <w:color w:val="EE0000"/>
               </w:rPr>
             </w:pPr>
@@ -3562,7 +3522,6 @@
           <w:p>
             <w:pPr>
               <w:rPr>
-                <w:rFonts w:hint="eastAsia"/>
                 <w:color w:val="EE0000"/>
               </w:rPr>
             </w:pPr>
@@ -3676,7 +3635,6 @@
           <w:p>
             <w:pPr>
               <w:rPr>
-                <w:rFonts w:hint="eastAsia"/>
                 <w:color w:val="EE0000"/>
               </w:rPr>
             </w:pPr>
@@ -3703,7 +3661,6 @@
           <w:p>
             <w:pPr>
               <w:rPr>
-                <w:rFonts w:hint="eastAsia"/>
                 <w:color w:val="EE0000"/>
               </w:rPr>
             </w:pPr>
@@ -3736,7 +3693,6 @@
           <w:p>
             <w:pPr>
               <w:rPr>
-                <w:rFonts w:hint="eastAsia"/>
                 <w:color w:val="EE0000"/>
               </w:rPr>
             </w:pPr>
@@ -4209,11 +4165,6 @@
             <w:hideMark/>
           </w:tcPr>
           <w:p>
-            <w:pPr>
-              <w:rPr>
-                <w:rFonts w:hint="eastAsia"/>
-              </w:rPr>
-            </w:pPr>
             <w:r>
               <w:rPr>
                 <w:rFonts w:hint="eastAsia"/>
@@ -4240,11 +4191,6 @@
             <w:hideMark/>
           </w:tcPr>
           <w:p>
-            <w:pPr>
-              <w:rPr>
-                <w:rFonts w:hint="eastAsia"/>
-              </w:rPr>
-            </w:pPr>
             <w:r>
               <w:t>9.30</w:t>
             </w:r>
@@ -4268,11 +4214,6 @@
             <w:hideMark/>
           </w:tcPr>
           <w:p>
-            <w:pPr>
-              <w:rPr>
-                <w:rFonts w:hint="eastAsia"/>
-              </w:rPr>
-            </w:pPr>
             <w:r>
               <w:t>0.01</w:t>
             </w:r>
@@ -4360,7 +4301,6 @@
           <w:p>
             <w:pPr>
               <w:rPr>
-                <w:rFonts w:hint="eastAsia"/>
                 <w:color w:val="EE0000"/>
               </w:rPr>
             </w:pPr>
@@ -4393,7 +4333,6 @@
           <w:p>
             <w:pPr>
               <w:rPr>
-                <w:rFonts w:hint="eastAsia"/>
                 <w:color w:val="EE0000"/>
               </w:rPr>
             </w:pPr>
@@ -4512,7 +4451,6 @@
           <w:p>
             <w:pPr>
               <w:rPr>
-                <w:rFonts w:hint="eastAsia"/>
                 <w:color w:val="EE0000"/>
               </w:rPr>
             </w:pPr>
@@ -4539,7 +4477,6 @@
           <w:p>
             <w:pPr>
               <w:rPr>
-                <w:rFonts w:hint="eastAsia"/>
                 <w:color w:val="EE0000"/>
               </w:rPr>
             </w:pPr>
@@ -4566,7 +4503,6 @@
           <w:p>
             <w:pPr>
               <w:rPr>
-                <w:rFonts w:hint="eastAsia"/>
                 <w:color w:val="EE0000"/>
               </w:rPr>
             </w:pPr>
@@ -4673,7 +4609,6 @@
           <w:p>
             <w:pPr>
               <w:rPr>
-                <w:rFonts w:hint="eastAsia"/>
                 <w:color w:val="EE0000"/>
               </w:rPr>
             </w:pPr>
@@ -4700,7 +4635,6 @@
           <w:p>
             <w:pPr>
               <w:rPr>
-                <w:rFonts w:hint="eastAsia"/>
                 <w:color w:val="EE0000"/>
               </w:rPr>
             </w:pPr>
@@ -4727,7 +4661,6 @@
           <w:p>
             <w:pPr>
               <w:rPr>
-                <w:rFonts w:hint="eastAsia"/>
                 <w:color w:val="EE0000"/>
               </w:rPr>
             </w:pPr>
@@ -5350,7 +5283,6 @@
           <w:p>
             <w:pPr>
               <w:rPr>
-                <w:rFonts w:hint="eastAsia"/>
                 <w:color w:val="EE0000"/>
               </w:rPr>
             </w:pPr>
@@ -5383,7 +5315,6 @@
           <w:p>
             <w:pPr>
               <w:rPr>
-                <w:rFonts w:hint="eastAsia"/>
                 <w:color w:val="EE0000"/>
               </w:rPr>
             </w:pPr>
@@ -5759,13 +5690,7 @@
     </w:tbl>
     <w:p/>
     <w:p/>
-    <w:p>
-      <w:pPr>
-        <w:rPr>
-          <w:rFonts w:hint="eastAsia"/>
-        </w:rPr>
-      </w:pPr>
-    </w:p>
+    <w:p/>
     <w:p>
       <w:pPr>
         <w:pStyle w:val="2"/>
@@ -5846,7 +5771,7 @@
             <w:pPr>
               <w:jc w:val="right"/>
               <w:rPr>
-                <w:rFonts w:ascii="Times New Roman" w:hAnsi="Times New Roman" w:hint="eastAsia"/>
+                <w:rFonts w:ascii="Times New Roman" w:hAnsi="Times New Roman"/>
                 <w:b/>
                 <w:bCs/>
                 <w:szCs w:val="22"/>
@@ -6554,6 +6479,949 @@
         <w:pStyle w:val="af"/>
         <w:jc w:val="both"/>
       </w:pPr>
+      <w:r>
+        <w:rPr>
+          <w:rFonts w:hint="eastAsia"/>
+        </w:rPr>
+        <w:t>如果选最优的：</w:t>
+      </w:r>
+    </w:p>
+    <w:tbl>
+      <w:tblPr>
+        <w:tblStyle w:val="ae"/>
+        <w:tblW w:w="0" w:type="auto"/>
+        <w:tblLook w:val="04A0" w:firstRow="1" w:lastRow="0" w:firstColumn="1" w:lastColumn="0" w:noHBand="0" w:noVBand="1"/>
+      </w:tblPr>
+      <w:tblGrid>
+        <w:gridCol w:w="828"/>
+        <w:gridCol w:w="1867"/>
+        <w:gridCol w:w="1867"/>
+        <w:gridCol w:w="1867"/>
+        <w:gridCol w:w="1867"/>
+      </w:tblGrid>
+      <w:tr>
+        <w:tc>
+          <w:tcPr>
+            <w:tcW w:w="0" w:type="auto"/>
+            <w:tcBorders>
+              <w:top w:val="single" w:sz="4" w:space="0" w:color="auto"/>
+              <w:left w:val="single" w:sz="4" w:space="0" w:color="auto"/>
+              <w:bottom w:val="single" w:sz="4" w:space="0" w:color="auto"/>
+              <w:right w:val="single" w:sz="4" w:space="0" w:color="auto"/>
+            </w:tcBorders>
+            <w:noWrap/>
+            <w:hideMark/>
+          </w:tcPr>
+          <w:p>
+            <w:pPr>
+              <w:rPr>
+                <w:rFonts w:ascii="宋体" w:hAnsi="宋体" w:cs="宋体"/>
+                <w:b/>
+                <w:bCs/>
+              </w:rPr>
+            </w:pPr>
+            <w:r>
+              <w:rPr>
+                <w:rFonts w:hint="eastAsia"/>
+                <w:b/>
+                <w:bCs/>
+              </w:rPr>
+              <w:t>程序池</w:t>
+            </w:r>
+          </w:p>
+        </w:tc>
+        <w:tc>
+          <w:tcPr>
+            <w:tcW w:w="0" w:type="auto"/>
+            <w:tcBorders>
+              <w:top w:val="single" w:sz="4" w:space="0" w:color="auto"/>
+              <w:left w:val="single" w:sz="4" w:space="0" w:color="auto"/>
+              <w:bottom w:val="single" w:sz="4" w:space="0" w:color="auto"/>
+              <w:right w:val="single" w:sz="4" w:space="0" w:color="auto"/>
+            </w:tcBorders>
+            <w:noWrap/>
+            <w:hideMark/>
+          </w:tcPr>
+          <w:p>
+            <w:pPr>
+              <w:jc w:val="right"/>
+              <w:rPr>
+                <w:rFonts w:ascii="Times New Roman" w:hAnsi="Times New Roman"/>
+                <w:b/>
+                <w:bCs/>
+                <w:szCs w:val="22"/>
+              </w:rPr>
+            </w:pPr>
+            <w:r>
+              <w:rPr>
+                <w:b/>
+                <w:bCs/>
+              </w:rPr>
+              <w:t>lane=5</w:t>
+            </w:r>
+            <w:r>
+              <w:rPr>
+                <w:rFonts w:hint="eastAsia"/>
+                <w:b/>
+                <w:bCs/>
+              </w:rPr>
+              <w:t>（</w:t>
+            </w:r>
+            <w:r>
+              <w:rPr>
+                <w:b/>
+                <w:bCs/>
+              </w:rPr>
+              <w:t>max-5</w:t>
+            </w:r>
+            <w:r>
+              <w:rPr>
+                <w:rFonts w:hint="eastAsia"/>
+                <w:b/>
+                <w:bCs/>
+              </w:rPr>
+              <w:t>）</w:t>
+            </w:r>
+          </w:p>
+        </w:tc>
+        <w:tc>
+          <w:tcPr>
+            <w:tcW w:w="0" w:type="auto"/>
+            <w:tcBorders>
+              <w:top w:val="single" w:sz="4" w:space="0" w:color="auto"/>
+              <w:left w:val="single" w:sz="4" w:space="0" w:color="auto"/>
+              <w:bottom w:val="single" w:sz="4" w:space="0" w:color="auto"/>
+              <w:right w:val="single" w:sz="4" w:space="0" w:color="auto"/>
+            </w:tcBorders>
+            <w:noWrap/>
+            <w:hideMark/>
+          </w:tcPr>
+          <w:p>
+            <w:pPr>
+              <w:jc w:val="right"/>
+              <w:rPr>
+                <w:b/>
+                <w:bCs/>
+              </w:rPr>
+            </w:pPr>
+            <w:r>
+              <w:rPr>
+                <w:b/>
+                <w:bCs/>
+              </w:rPr>
+              <w:t>lane=4</w:t>
+            </w:r>
+            <w:r>
+              <w:rPr>
+                <w:rFonts w:hint="eastAsia"/>
+                <w:b/>
+                <w:bCs/>
+              </w:rPr>
+              <w:t>（</w:t>
+            </w:r>
+            <w:r>
+              <w:rPr>
+                <w:b/>
+                <w:bCs/>
+              </w:rPr>
+              <w:t>max-4</w:t>
+            </w:r>
+            <w:r>
+              <w:rPr>
+                <w:rFonts w:hint="eastAsia"/>
+                <w:b/>
+                <w:bCs/>
+              </w:rPr>
+              <w:t>）</w:t>
+            </w:r>
+          </w:p>
+        </w:tc>
+        <w:tc>
+          <w:tcPr>
+            <w:tcW w:w="0" w:type="auto"/>
+            <w:tcBorders>
+              <w:top w:val="single" w:sz="4" w:space="0" w:color="auto"/>
+              <w:left w:val="single" w:sz="4" w:space="0" w:color="auto"/>
+              <w:bottom w:val="single" w:sz="4" w:space="0" w:color="auto"/>
+              <w:right w:val="single" w:sz="4" w:space="0" w:color="auto"/>
+            </w:tcBorders>
+            <w:noWrap/>
+            <w:hideMark/>
+          </w:tcPr>
+          <w:p>
+            <w:pPr>
+              <w:jc w:val="right"/>
+              <w:rPr>
+                <w:b/>
+                <w:bCs/>
+              </w:rPr>
+            </w:pPr>
+            <w:r>
+              <w:rPr>
+                <w:b/>
+                <w:bCs/>
+              </w:rPr>
+              <w:t>lane=3</w:t>
+            </w:r>
+            <w:r>
+              <w:rPr>
+                <w:rFonts w:hint="eastAsia"/>
+                <w:b/>
+                <w:bCs/>
+              </w:rPr>
+              <w:t>（</w:t>
+            </w:r>
+            <w:r>
+              <w:rPr>
+                <w:b/>
+                <w:bCs/>
+              </w:rPr>
+              <w:t>max-3</w:t>
+            </w:r>
+            <w:r>
+              <w:rPr>
+                <w:rFonts w:hint="eastAsia"/>
+                <w:b/>
+                <w:bCs/>
+              </w:rPr>
+              <w:t>）</w:t>
+            </w:r>
+          </w:p>
+        </w:tc>
+        <w:tc>
+          <w:tcPr>
+            <w:tcW w:w="0" w:type="auto"/>
+            <w:tcBorders>
+              <w:top w:val="single" w:sz="4" w:space="0" w:color="auto"/>
+              <w:left w:val="single" w:sz="4" w:space="0" w:color="auto"/>
+              <w:bottom w:val="single" w:sz="4" w:space="0" w:color="auto"/>
+              <w:right w:val="single" w:sz="4" w:space="0" w:color="auto"/>
+            </w:tcBorders>
+            <w:noWrap/>
+            <w:hideMark/>
+          </w:tcPr>
+          <w:p>
+            <w:pPr>
+              <w:jc w:val="right"/>
+              <w:rPr>
+                <w:b/>
+                <w:bCs/>
+              </w:rPr>
+            </w:pPr>
+            <w:r>
+              <w:rPr>
+                <w:b/>
+                <w:bCs/>
+              </w:rPr>
+              <w:t>lane=2</w:t>
+            </w:r>
+            <w:r>
+              <w:rPr>
+                <w:rFonts w:hint="eastAsia"/>
+                <w:b/>
+                <w:bCs/>
+              </w:rPr>
+              <w:t>（</w:t>
+            </w:r>
+            <w:r>
+              <w:rPr>
+                <w:b/>
+                <w:bCs/>
+              </w:rPr>
+              <w:t>max-2</w:t>
+            </w:r>
+            <w:r>
+              <w:rPr>
+                <w:rFonts w:hint="eastAsia"/>
+                <w:b/>
+                <w:bCs/>
+              </w:rPr>
+              <w:t>）</w:t>
+            </w:r>
+          </w:p>
+        </w:tc>
+      </w:tr>
+      <w:tr>
+        <w:tc>
+          <w:tcPr>
+            <w:tcW w:w="0" w:type="auto"/>
+            <w:tcBorders>
+              <w:top w:val="single" w:sz="4" w:space="0" w:color="auto"/>
+              <w:left w:val="single" w:sz="4" w:space="0" w:color="auto"/>
+              <w:bottom w:val="single" w:sz="4" w:space="0" w:color="auto"/>
+              <w:right w:val="single" w:sz="4" w:space="0" w:color="auto"/>
+            </w:tcBorders>
+            <w:hideMark/>
+          </w:tcPr>
+          <w:p>
+            <w:r>
+              <w:t>BERT</w:t>
+            </w:r>
+            <w:r>
+              <w:rPr>
+                <w:rFonts w:hint="eastAsia"/>
+              </w:rPr>
+              <w:t>（</w:t>
+            </w:r>
+            <w:r>
+              <w:t xml:space="preserve">4 </w:t>
+            </w:r>
+            <w:r>
+              <w:rPr>
+                <w:rFonts w:hint="eastAsia"/>
+              </w:rPr>
+              <w:t>程序）</w:t>
+            </w:r>
+          </w:p>
+        </w:tc>
+        <w:tc>
+          <w:tcPr>
+            <w:tcW w:w="0" w:type="auto"/>
+            <w:tcBorders>
+              <w:top w:val="single" w:sz="4" w:space="0" w:color="auto"/>
+              <w:left w:val="single" w:sz="4" w:space="0" w:color="auto"/>
+              <w:bottom w:val="single" w:sz="4" w:space="0" w:color="auto"/>
+              <w:right w:val="single" w:sz="4" w:space="0" w:color="auto"/>
+            </w:tcBorders>
+            <w:hideMark/>
+          </w:tcPr>
+          <w:p>
+            <w:pPr>
+              <w:jc w:val="right"/>
+            </w:pPr>
+            <w:r>
+              <w:t>7,620</w:t>
+            </w:r>
+          </w:p>
+        </w:tc>
+        <w:tc>
+          <w:tcPr>
+            <w:tcW w:w="0" w:type="auto"/>
+            <w:tcBorders>
+              <w:top w:val="single" w:sz="4" w:space="0" w:color="auto"/>
+              <w:left w:val="single" w:sz="4" w:space="0" w:color="auto"/>
+              <w:bottom w:val="single" w:sz="4" w:space="0" w:color="auto"/>
+              <w:right w:val="single" w:sz="4" w:space="0" w:color="auto"/>
+            </w:tcBorders>
+            <w:hideMark/>
+          </w:tcPr>
+          <w:p>
+            <w:pPr>
+              <w:jc w:val="right"/>
+            </w:pPr>
+            <w:r>
+              <w:t>7,620</w:t>
+            </w:r>
+            <w:r>
+              <w:rPr>
+                <w:rFonts w:hint="eastAsia"/>
+              </w:rPr>
+              <w:t>（</w:t>
+            </w:r>
+            <w:r>
+              <w:t>100.0%</w:t>
+            </w:r>
+            <w:r>
+              <w:rPr>
+                <w:rFonts w:hint="eastAsia"/>
+              </w:rPr>
+              <w:t>）</w:t>
+            </w:r>
+          </w:p>
+        </w:tc>
+        <w:tc>
+          <w:tcPr>
+            <w:tcW w:w="0" w:type="auto"/>
+            <w:tcBorders>
+              <w:top w:val="single" w:sz="4" w:space="0" w:color="auto"/>
+              <w:left w:val="single" w:sz="4" w:space="0" w:color="auto"/>
+              <w:bottom w:val="single" w:sz="4" w:space="0" w:color="auto"/>
+              <w:right w:val="single" w:sz="4" w:space="0" w:color="auto"/>
+            </w:tcBorders>
+            <w:hideMark/>
+          </w:tcPr>
+          <w:p>
+            <w:pPr>
+              <w:jc w:val="right"/>
+            </w:pPr>
+            <w:bookmarkStart w:id="7" w:name="OLE_LINK1"/>
+            <w:r>
+              <w:t>7,620</w:t>
+            </w:r>
+            <w:bookmarkEnd w:id="7"/>
+            <w:r>
+              <w:rPr>
+                <w:rFonts w:hint="eastAsia"/>
+              </w:rPr>
+              <w:t>（</w:t>
+            </w:r>
+            <w:r>
+              <w:rPr>
+                <w:rFonts w:hint="eastAsia"/>
+              </w:rPr>
+              <w:t>100.0</w:t>
+            </w:r>
+            <w:r>
+              <w:t>%</w:t>
+            </w:r>
+            <w:r>
+              <w:rPr>
+                <w:rFonts w:hint="eastAsia"/>
+              </w:rPr>
+              <w:t>）</w:t>
+            </w:r>
+          </w:p>
+        </w:tc>
+        <w:tc>
+          <w:tcPr>
+            <w:tcW w:w="0" w:type="auto"/>
+            <w:tcBorders>
+              <w:top w:val="single" w:sz="4" w:space="0" w:color="auto"/>
+              <w:left w:val="single" w:sz="4" w:space="0" w:color="auto"/>
+              <w:bottom w:val="single" w:sz="4" w:space="0" w:color="auto"/>
+              <w:right w:val="single" w:sz="4" w:space="0" w:color="auto"/>
+            </w:tcBorders>
+            <w:hideMark/>
+          </w:tcPr>
+          <w:p>
+            <w:pPr>
+              <w:jc w:val="right"/>
+            </w:pPr>
+            <w:r>
+              <w:t>7,838</w:t>
+            </w:r>
+            <w:r>
+              <w:rPr>
+                <w:rFonts w:hint="eastAsia"/>
+              </w:rPr>
+              <w:t>（</w:t>
+            </w:r>
+            <w:r>
+              <w:t>10</w:t>
+            </w:r>
+            <w:r>
+              <w:rPr>
+                <w:rFonts w:hint="eastAsia"/>
+              </w:rPr>
+              <w:t>8</w:t>
+            </w:r>
+            <w:r>
+              <w:t>.</w:t>
+            </w:r>
+            <w:r>
+              <w:rPr>
+                <w:rFonts w:hint="eastAsia"/>
+              </w:rPr>
+              <w:t>0</w:t>
+            </w:r>
+            <w:r>
+              <w:t>%</w:t>
+            </w:r>
+            <w:r>
+              <w:rPr>
+                <w:rFonts w:hint="eastAsia"/>
+              </w:rPr>
+              <w:t>）</w:t>
+            </w:r>
+          </w:p>
+        </w:tc>
+      </w:tr>
+      <w:tr>
+        <w:tc>
+          <w:tcPr>
+            <w:tcW w:w="0" w:type="auto"/>
+            <w:tcBorders>
+              <w:top w:val="single" w:sz="4" w:space="0" w:color="auto"/>
+              <w:left w:val="single" w:sz="4" w:space="0" w:color="auto"/>
+              <w:bottom w:val="single" w:sz="4" w:space="0" w:color="auto"/>
+              <w:right w:val="single" w:sz="4" w:space="0" w:color="auto"/>
+            </w:tcBorders>
+            <w:hideMark/>
+          </w:tcPr>
+          <w:p>
+            <w:r>
+              <w:t>SD-</w:t>
+            </w:r>
+            <w:proofErr w:type="spellStart"/>
+            <w:r>
+              <w:t>UNet</w:t>
+            </w:r>
+            <w:proofErr w:type="spellEnd"/>
+            <w:r>
+              <w:rPr>
+                <w:rFonts w:hint="eastAsia"/>
+              </w:rPr>
+              <w:t>（</w:t>
+            </w:r>
+            <w:r>
+              <w:t xml:space="preserve">5 </w:t>
+            </w:r>
+            <w:r>
+              <w:rPr>
+                <w:rFonts w:hint="eastAsia"/>
+              </w:rPr>
+              <w:t>程序）</w:t>
+            </w:r>
+          </w:p>
+        </w:tc>
+        <w:tc>
+          <w:tcPr>
+            <w:tcW w:w="0" w:type="auto"/>
+            <w:tcBorders>
+              <w:top w:val="single" w:sz="4" w:space="0" w:color="auto"/>
+              <w:left w:val="single" w:sz="4" w:space="0" w:color="auto"/>
+              <w:bottom w:val="single" w:sz="4" w:space="0" w:color="auto"/>
+              <w:right w:val="single" w:sz="4" w:space="0" w:color="auto"/>
+            </w:tcBorders>
+            <w:hideMark/>
+          </w:tcPr>
+          <w:p>
+            <w:pPr>
+              <w:jc w:val="right"/>
+            </w:pPr>
+            <w:r>
+              <w:t>11,650</w:t>
+            </w:r>
+          </w:p>
+        </w:tc>
+        <w:tc>
+          <w:tcPr>
+            <w:tcW w:w="0" w:type="auto"/>
+            <w:tcBorders>
+              <w:top w:val="single" w:sz="4" w:space="0" w:color="auto"/>
+              <w:left w:val="single" w:sz="4" w:space="0" w:color="auto"/>
+              <w:bottom w:val="single" w:sz="4" w:space="0" w:color="auto"/>
+              <w:right w:val="single" w:sz="4" w:space="0" w:color="auto"/>
+            </w:tcBorders>
+            <w:hideMark/>
+          </w:tcPr>
+          <w:p>
+            <w:pPr>
+              <w:jc w:val="right"/>
+            </w:pPr>
+            <w:r>
+              <w:t>11,650</w:t>
+            </w:r>
+            <w:r>
+              <w:rPr>
+                <w:rFonts w:hint="eastAsia"/>
+              </w:rPr>
+              <w:t>（</w:t>
+            </w:r>
+            <w:r>
+              <w:t>100.0%</w:t>
+            </w:r>
+            <w:r>
+              <w:rPr>
+                <w:rFonts w:hint="eastAsia"/>
+              </w:rPr>
+              <w:t>）</w:t>
+            </w:r>
+          </w:p>
+        </w:tc>
+        <w:tc>
+          <w:tcPr>
+            <w:tcW w:w="0" w:type="auto"/>
+            <w:tcBorders>
+              <w:top w:val="single" w:sz="4" w:space="0" w:color="auto"/>
+              <w:left w:val="single" w:sz="4" w:space="0" w:color="auto"/>
+              <w:bottom w:val="single" w:sz="4" w:space="0" w:color="auto"/>
+              <w:right w:val="single" w:sz="4" w:space="0" w:color="auto"/>
+            </w:tcBorders>
+            <w:hideMark/>
+          </w:tcPr>
+          <w:p>
+            <w:pPr>
+              <w:jc w:val="right"/>
+            </w:pPr>
+            <w:bookmarkStart w:id="8" w:name="OLE_LINK2"/>
+            <w:r>
+              <w:t>11,650</w:t>
+            </w:r>
+            <w:bookmarkEnd w:id="8"/>
+            <w:r>
+              <w:rPr>
+                <w:rFonts w:hint="eastAsia"/>
+              </w:rPr>
+              <w:t>（</w:t>
+            </w:r>
+            <w:r>
+              <w:rPr>
+                <w:rFonts w:hint="eastAsia"/>
+              </w:rPr>
+              <w:t>100.0</w:t>
+            </w:r>
+            <w:r>
+              <w:t>%</w:t>
+            </w:r>
+            <w:r>
+              <w:rPr>
+                <w:rFonts w:hint="eastAsia"/>
+              </w:rPr>
+              <w:t>）</w:t>
+            </w:r>
+          </w:p>
+        </w:tc>
+        <w:tc>
+          <w:tcPr>
+            <w:tcW w:w="0" w:type="auto"/>
+            <w:tcBorders>
+              <w:top w:val="single" w:sz="4" w:space="0" w:color="auto"/>
+              <w:left w:val="single" w:sz="4" w:space="0" w:color="auto"/>
+              <w:bottom w:val="single" w:sz="4" w:space="0" w:color="auto"/>
+              <w:right w:val="single" w:sz="4" w:space="0" w:color="auto"/>
+            </w:tcBorders>
+            <w:hideMark/>
+          </w:tcPr>
+          <w:p>
+            <w:pPr>
+              <w:jc w:val="right"/>
+            </w:pPr>
+            <w:r>
+              <w:t>11,655</w:t>
+            </w:r>
+            <w:r>
+              <w:rPr>
+                <w:rFonts w:hint="eastAsia"/>
+              </w:rPr>
+              <w:t>（</w:t>
+            </w:r>
+            <w:r>
+              <w:rPr>
+                <w:rFonts w:hint="eastAsia"/>
+              </w:rPr>
+              <w:t>100.0</w:t>
+            </w:r>
+            <w:r>
+              <w:t>%</w:t>
+            </w:r>
+            <w:r>
+              <w:rPr>
+                <w:rFonts w:hint="eastAsia"/>
+              </w:rPr>
+              <w:t>）</w:t>
+            </w:r>
+          </w:p>
+        </w:tc>
+      </w:tr>
+      <w:tr>
+        <w:tc>
+          <w:tcPr>
+            <w:tcW w:w="0" w:type="auto"/>
+            <w:tcBorders>
+              <w:top w:val="single" w:sz="4" w:space="0" w:color="auto"/>
+              <w:left w:val="single" w:sz="4" w:space="0" w:color="auto"/>
+              <w:bottom w:val="single" w:sz="4" w:space="0" w:color="auto"/>
+              <w:right w:val="single" w:sz="4" w:space="0" w:color="auto"/>
+            </w:tcBorders>
+            <w:hideMark/>
+          </w:tcPr>
+          <w:p>
+            <w:proofErr w:type="spellStart"/>
+            <w:r>
+              <w:t>LLaMA</w:t>
+            </w:r>
+            <w:proofErr w:type="spellEnd"/>
+            <w:r>
+              <w:rPr>
+                <w:rFonts w:hint="eastAsia"/>
+              </w:rPr>
+              <w:t>（</w:t>
+            </w:r>
+            <w:r>
+              <w:t xml:space="preserve">3 </w:t>
+            </w:r>
+            <w:r>
+              <w:rPr>
+                <w:rFonts w:hint="eastAsia"/>
+              </w:rPr>
+              <w:t>程序）</w:t>
+            </w:r>
+          </w:p>
+        </w:tc>
+        <w:tc>
+          <w:tcPr>
+            <w:tcW w:w="0" w:type="auto"/>
+            <w:tcBorders>
+              <w:top w:val="single" w:sz="4" w:space="0" w:color="auto"/>
+              <w:left w:val="single" w:sz="4" w:space="0" w:color="auto"/>
+              <w:bottom w:val="single" w:sz="4" w:space="0" w:color="auto"/>
+              <w:right w:val="single" w:sz="4" w:space="0" w:color="auto"/>
+            </w:tcBorders>
+            <w:hideMark/>
+          </w:tcPr>
+          <w:p>
+            <w:pPr>
+              <w:jc w:val="right"/>
+            </w:pPr>
+            <w:r>
+              <w:t>30,698</w:t>
+            </w:r>
+          </w:p>
+        </w:tc>
+        <w:tc>
+          <w:tcPr>
+            <w:tcW w:w="0" w:type="auto"/>
+            <w:tcBorders>
+              <w:top w:val="single" w:sz="4" w:space="0" w:color="auto"/>
+              <w:left w:val="single" w:sz="4" w:space="0" w:color="auto"/>
+              <w:bottom w:val="single" w:sz="4" w:space="0" w:color="auto"/>
+              <w:right w:val="single" w:sz="4" w:space="0" w:color="auto"/>
+            </w:tcBorders>
+            <w:hideMark/>
+          </w:tcPr>
+          <w:p>
+            <w:pPr>
+              <w:jc w:val="right"/>
+            </w:pPr>
+            <w:r>
+              <w:t>30,698</w:t>
+            </w:r>
+            <w:r>
+              <w:rPr>
+                <w:rFonts w:hint="eastAsia"/>
+              </w:rPr>
+              <w:t>（</w:t>
+            </w:r>
+            <w:r>
+              <w:t>100.0%</w:t>
+            </w:r>
+            <w:r>
+              <w:rPr>
+                <w:rFonts w:hint="eastAsia"/>
+              </w:rPr>
+              <w:t>）</w:t>
+            </w:r>
+          </w:p>
+        </w:tc>
+        <w:tc>
+          <w:tcPr>
+            <w:tcW w:w="0" w:type="auto"/>
+            <w:tcBorders>
+              <w:top w:val="single" w:sz="4" w:space="0" w:color="auto"/>
+              <w:left w:val="single" w:sz="4" w:space="0" w:color="auto"/>
+              <w:bottom w:val="single" w:sz="4" w:space="0" w:color="auto"/>
+              <w:right w:val="single" w:sz="4" w:space="0" w:color="auto"/>
+            </w:tcBorders>
+            <w:hideMark/>
+          </w:tcPr>
+          <w:p>
+            <w:pPr>
+              <w:jc w:val="right"/>
+            </w:pPr>
+            <w:bookmarkStart w:id="9" w:name="OLE_LINK3"/>
+            <w:r>
+              <w:t>30,698</w:t>
+            </w:r>
+            <w:bookmarkEnd w:id="9"/>
+            <w:r>
+              <w:rPr>
+                <w:rFonts w:hint="eastAsia"/>
+              </w:rPr>
+              <w:t>（</w:t>
+            </w:r>
+            <w:r>
+              <w:t>100.0%</w:t>
+            </w:r>
+            <w:r>
+              <w:rPr>
+                <w:rFonts w:hint="eastAsia"/>
+              </w:rPr>
+              <w:t>）</w:t>
+            </w:r>
+          </w:p>
+        </w:tc>
+        <w:tc>
+          <w:tcPr>
+            <w:tcW w:w="0" w:type="auto"/>
+            <w:tcBorders>
+              <w:top w:val="single" w:sz="4" w:space="0" w:color="auto"/>
+              <w:left w:val="single" w:sz="4" w:space="0" w:color="auto"/>
+              <w:bottom w:val="single" w:sz="4" w:space="0" w:color="auto"/>
+              <w:right w:val="single" w:sz="4" w:space="0" w:color="auto"/>
+            </w:tcBorders>
+            <w:hideMark/>
+          </w:tcPr>
+          <w:p>
+            <w:pPr>
+              <w:jc w:val="right"/>
+            </w:pPr>
+            <w:r>
+              <w:t>30,871</w:t>
+            </w:r>
+            <w:r>
+              <w:rPr>
+                <w:rFonts w:hint="eastAsia"/>
+              </w:rPr>
+              <w:t>（</w:t>
+            </w:r>
+            <w:r>
+              <w:t>100.</w:t>
+            </w:r>
+            <w:r>
+              <w:rPr>
+                <w:rFonts w:hint="eastAsia"/>
+              </w:rPr>
+              <w:t>6</w:t>
+            </w:r>
+            <w:r>
+              <w:t>%</w:t>
+            </w:r>
+            <w:r>
+              <w:rPr>
+                <w:rFonts w:hint="eastAsia"/>
+              </w:rPr>
+              <w:t>）</w:t>
+            </w:r>
+          </w:p>
+        </w:tc>
+      </w:tr>
+      <w:tr>
+        <w:tc>
+          <w:tcPr>
+            <w:tcW w:w="0" w:type="auto"/>
+            <w:tcBorders>
+              <w:top w:val="single" w:sz="4" w:space="0" w:color="auto"/>
+              <w:left w:val="single" w:sz="4" w:space="0" w:color="auto"/>
+              <w:bottom w:val="single" w:sz="4" w:space="0" w:color="auto"/>
+              <w:right w:val="single" w:sz="4" w:space="0" w:color="auto"/>
+            </w:tcBorders>
+          </w:tcPr>
+          <w:p>
+            <w:r>
+              <w:t>T</w:t>
+            </w:r>
+            <w:r>
+              <w:rPr>
+                <w:rFonts w:hint="eastAsia"/>
+              </w:rPr>
+              <w:t>otal</w:t>
+            </w:r>
+          </w:p>
+        </w:tc>
+        <w:tc>
+          <w:tcPr>
+            <w:tcW w:w="0" w:type="auto"/>
+            <w:tcBorders>
+              <w:top w:val="single" w:sz="4" w:space="0" w:color="auto"/>
+              <w:left w:val="single" w:sz="4" w:space="0" w:color="auto"/>
+              <w:bottom w:val="single" w:sz="4" w:space="0" w:color="auto"/>
+              <w:right w:val="single" w:sz="4" w:space="0" w:color="auto"/>
+            </w:tcBorders>
+          </w:tcPr>
+          <w:p>
+            <w:pPr>
+              <w:jc w:val="right"/>
+              <w:rPr>
+                <w:rFonts w:hint="eastAsia"/>
+              </w:rPr>
+            </w:pPr>
+            <w:r>
+              <w:rPr>
+                <w:rFonts w:hint="eastAsia"/>
+              </w:rPr>
+              <w:t>49968</w:t>
+            </w:r>
+          </w:p>
+        </w:tc>
+        <w:tc>
+          <w:tcPr>
+            <w:tcW w:w="0" w:type="auto"/>
+            <w:tcBorders>
+              <w:top w:val="single" w:sz="4" w:space="0" w:color="auto"/>
+              <w:left w:val="single" w:sz="4" w:space="0" w:color="auto"/>
+              <w:bottom w:val="single" w:sz="4" w:space="0" w:color="auto"/>
+              <w:right w:val="single" w:sz="4" w:space="0" w:color="auto"/>
+            </w:tcBorders>
+          </w:tcPr>
+          <w:p>
+            <w:pPr>
+              <w:jc w:val="right"/>
+              <w:rPr>
+                <w:rFonts w:hint="eastAsia"/>
+              </w:rPr>
+            </w:pPr>
+            <w:r>
+              <w:rPr>
+                <w:rFonts w:hint="eastAsia"/>
+              </w:rPr>
+              <w:t>49968</w:t>
+            </w:r>
+          </w:p>
+        </w:tc>
+        <w:tc>
+          <w:tcPr>
+            <w:tcW w:w="0" w:type="auto"/>
+            <w:tcBorders>
+              <w:top w:val="single" w:sz="4" w:space="0" w:color="auto"/>
+              <w:left w:val="single" w:sz="4" w:space="0" w:color="auto"/>
+              <w:bottom w:val="single" w:sz="4" w:space="0" w:color="auto"/>
+              <w:right w:val="single" w:sz="4" w:space="0" w:color="auto"/>
+            </w:tcBorders>
+          </w:tcPr>
+          <w:p>
+            <w:pPr>
+              <w:jc w:val="right"/>
+              <w:rPr>
+                <w:rFonts w:hint="eastAsia"/>
+              </w:rPr>
+            </w:pPr>
+            <w:r>
+              <w:rPr>
+                <w:rFonts w:hint="eastAsia"/>
+              </w:rPr>
+              <w:t>49968</w:t>
+            </w:r>
+          </w:p>
+        </w:tc>
+        <w:tc>
+          <w:tcPr>
+            <w:tcW w:w="0" w:type="auto"/>
+            <w:tcBorders>
+              <w:top w:val="single" w:sz="4" w:space="0" w:color="auto"/>
+              <w:left w:val="single" w:sz="4" w:space="0" w:color="auto"/>
+              <w:bottom w:val="single" w:sz="4" w:space="0" w:color="auto"/>
+              <w:right w:val="single" w:sz="4" w:space="0" w:color="auto"/>
+            </w:tcBorders>
+          </w:tcPr>
+          <w:p>
+            <w:pPr>
+              <w:wordWrap w:val="0"/>
+              <w:jc w:val="right"/>
+              <w:rPr>
+                <w:rFonts w:hint="eastAsia"/>
+              </w:rPr>
+            </w:pPr>
+            <w:r>
+              <w:rPr>
+                <w:rFonts w:hint="eastAsia"/>
+              </w:rPr>
+              <w:t>50364 （100.8%）</w:t>
+            </w:r>
+          </w:p>
+        </w:tc>
+      </w:tr>
+    </w:tbl>
+    <w:p>
+      <w:pPr>
+        <w:pStyle w:val="af"/>
+        <w:jc w:val="both"/>
+      </w:pPr>
+    </w:p>
+    <w:p>
+      <w:pPr>
+        <w:pStyle w:val="af"/>
+        <w:jc w:val="both"/>
+      </w:pPr>
+    </w:p>
+    <w:p>
+      <w:pPr>
+        <w:pStyle w:val="af"/>
+        <w:jc w:val="both"/>
+        <w:rPr>
+          <w:rFonts w:hint="eastAsia"/>
+        </w:rPr>
+      </w:pPr>
     </w:p>
     <w:p>
       <w:pPr>
@@ -6630,7 +7498,7 @@
             <w:pPr>
               <w:jc w:val="center"/>
               <w:rPr>
-                <w:rFonts w:ascii="Times New Roman" w:hAnsi="Times New Roman" w:hint="eastAsia"/>
+                <w:rFonts w:ascii="Times New Roman" w:hAnsi="Times New Roman"/>
                 <w:b/>
                 <w:bCs/>
                 <w:szCs w:val="22"/>
@@ -6880,9 +7748,6 @@
           <w:p>
             <w:pPr>
               <w:jc w:val="center"/>
-              <w:rPr>
-                <w:rFonts w:hint="eastAsia"/>
-              </w:rPr>
             </w:pPr>
             <w:r>
               <w:rPr>
@@ -6906,12 +7771,182 @@
           </w:tcPr>
           <w:p>
             <w:pPr>
+              <w:rPr>
+                <w:rFonts w:ascii="DengXian" w:eastAsia="DengXian" w:hAnsi="DengXian"/>
+                <w:kern w:val="0"/>
+                <w:sz w:val="20"/>
+                <w:szCs w:val="20"/>
+              </w:rPr>
+            </w:pPr>
+            <w:r>
               <w:rPr>
                 <w:rFonts w:ascii="DengXian" w:eastAsia="DengXian" w:hAnsi="DengXian" w:hint="eastAsia"/>
                 <w:kern w:val="0"/>
                 <w:sz w:val="20"/>
                 <w:szCs w:val="20"/>
               </w:rPr>
+              <w:t>1425</w:t>
+            </w:r>
+          </w:p>
+          <w:p>
+            <w:pPr>
+              <w:jc w:val="center"/>
+              <w:rPr>
+                <w:rFonts w:ascii="DengXian" w:eastAsia="DengXian" w:hAnsi="DengXian"/>
+                <w:sz w:val="20"/>
+                <w:szCs w:val="20"/>
+              </w:rPr>
+            </w:pPr>
+          </w:p>
+        </w:tc>
+        <w:tc>
+          <w:tcPr>
+            <w:tcW w:w="0" w:type="auto"/>
+            <w:tcBorders>
+              <w:top w:val="single" w:sz="4" w:space="0" w:color="auto"/>
+              <w:left w:val="single" w:sz="4" w:space="0" w:color="auto"/>
+              <w:bottom w:val="single" w:sz="4" w:space="0" w:color="auto"/>
+              <w:right w:val="single" w:sz="4" w:space="0" w:color="auto"/>
+            </w:tcBorders>
+            <w:vAlign w:val="center"/>
+            <w:hideMark/>
+          </w:tcPr>
+          <w:p>
+            <w:pPr>
+              <w:jc w:val="center"/>
+              <w:rPr>
+                <w:rFonts w:ascii="Times New Roman" w:eastAsia="宋体" w:hAnsi="Times New Roman"/>
+                <w:sz w:val="24"/>
+                <w:szCs w:val="22"/>
+              </w:rPr>
+            </w:pPr>
+            <w:r>
+              <w:t>12</w:t>
+            </w:r>
+            <w:r>
+              <w:rPr>
+                <w:rFonts w:hint="eastAsia"/>
+              </w:rPr>
+              <w:t>52</w:t>
+            </w:r>
+          </w:p>
+        </w:tc>
+        <w:tc>
+          <w:tcPr>
+            <w:tcW w:w="0" w:type="auto"/>
+            <w:tcBorders>
+              <w:top w:val="single" w:sz="4" w:space="0" w:color="auto"/>
+              <w:left w:val="single" w:sz="4" w:space="0" w:color="auto"/>
+              <w:bottom w:val="single" w:sz="4" w:space="0" w:color="auto"/>
+              <w:right w:val="single" w:sz="4" w:space="0" w:color="auto"/>
+            </w:tcBorders>
+            <w:vAlign w:val="center"/>
+            <w:hideMark/>
+          </w:tcPr>
+          <w:p>
+            <w:pPr>
+              <w:jc w:val="center"/>
+            </w:pPr>
+            <w:r>
+              <w:t>110</w:t>
+            </w:r>
+            <w:r>
+              <w:rPr>
+                <w:rFonts w:hint="eastAsia"/>
+              </w:rPr>
+              <w:t>6</w:t>
+            </w:r>
+          </w:p>
+        </w:tc>
+      </w:tr>
+      <w:tr>
+        <w:tc>
+          <w:tcPr>
+            <w:tcW w:w="0" w:type="auto"/>
+            <w:tcBorders>
+              <w:top w:val="single" w:sz="4" w:space="0" w:color="auto"/>
+              <w:left w:val="single" w:sz="4" w:space="0" w:color="auto"/>
+              <w:bottom w:val="single" w:sz="4" w:space="0" w:color="auto"/>
+              <w:right w:val="single" w:sz="4" w:space="0" w:color="auto"/>
+            </w:tcBorders>
+            <w:vAlign w:val="center"/>
+            <w:hideMark/>
+          </w:tcPr>
+          <w:p>
+            <w:pPr>
+              <w:jc w:val="center"/>
+            </w:pPr>
+            <w:r>
+              <w:t>SD-</w:t>
+            </w:r>
+            <w:proofErr w:type="spellStart"/>
+            <w:r>
+              <w:t>UNet</w:t>
+            </w:r>
+            <w:proofErr w:type="spellEnd"/>
+            <w:r>
+              <w:rPr>
+                <w:rFonts w:hint="eastAsia"/>
+              </w:rPr>
+              <w:t>（</w:t>
+            </w:r>
+            <w:r>
+              <w:t xml:space="preserve">5 </w:t>
+            </w:r>
+            <w:r>
+              <w:rPr>
+                <w:rFonts w:hint="eastAsia"/>
+              </w:rPr>
+              <w:t>程序）</w:t>
+            </w:r>
+          </w:p>
+        </w:tc>
+        <w:tc>
+          <w:tcPr>
+            <w:tcW w:w="0" w:type="auto"/>
+            <w:tcBorders>
+              <w:top w:val="single" w:sz="4" w:space="0" w:color="auto"/>
+              <w:left w:val="single" w:sz="4" w:space="0" w:color="auto"/>
+              <w:bottom w:val="single" w:sz="4" w:space="0" w:color="auto"/>
+              <w:right w:val="single" w:sz="4" w:space="0" w:color="auto"/>
+            </w:tcBorders>
+            <w:vAlign w:val="center"/>
+            <w:hideMark/>
+          </w:tcPr>
+          <w:p>
+            <w:pPr>
+              <w:jc w:val="center"/>
+            </w:pPr>
+            <w:r>
+              <w:rPr>
+                <w:rFonts w:hint="eastAsia"/>
+              </w:rPr>
+              <w:t>1563</w:t>
+            </w:r>
+          </w:p>
+        </w:tc>
+        <w:tc>
+          <w:tcPr>
+            <w:tcW w:w="0" w:type="auto"/>
+            <w:tcBorders>
+              <w:top w:val="single" w:sz="4" w:space="0" w:color="auto"/>
+              <w:left w:val="single" w:sz="4" w:space="0" w:color="auto"/>
+              <w:bottom w:val="single" w:sz="4" w:space="0" w:color="auto"/>
+              <w:right w:val="single" w:sz="4" w:space="0" w:color="auto"/>
+            </w:tcBorders>
+            <w:vAlign w:val="center"/>
+            <w:hideMark/>
+          </w:tcPr>
+          <w:p>
+            <w:pPr>
+              <w:ind w:hanging="720"/>
+              <w:jc w:val="center"/>
+              <w:rPr>
+                <w:rFonts w:ascii="DengXian" w:eastAsia="DengXian" w:hAnsi="DengXian"/>
+                <w:kern w:val="0"/>
+                <w:sz w:val="20"/>
+                <w:szCs w:val="20"/>
+              </w:rPr>
             </w:pPr>
             <w:r>
               <w:rPr>
@@ -6920,184 +7955,161 @@
                 <w:sz w:val="20"/>
                 <w:szCs w:val="20"/>
               </w:rPr>
-              <w:t>1425</w:t>
-            </w:r>
-          </w:p>
+              <w:t>1459</w:t>
+            </w:r>
+          </w:p>
+        </w:tc>
+        <w:tc>
+          <w:tcPr>
+            <w:tcW w:w="0" w:type="auto"/>
+            <w:tcBorders>
+              <w:top w:val="single" w:sz="4" w:space="0" w:color="auto"/>
+              <w:left w:val="single" w:sz="4" w:space="0" w:color="auto"/>
+              <w:bottom w:val="single" w:sz="4" w:space="0" w:color="auto"/>
+              <w:right w:val="single" w:sz="4" w:space="0" w:color="auto"/>
+            </w:tcBorders>
+            <w:vAlign w:val="center"/>
+            <w:hideMark/>
+          </w:tcPr>
           <w:p>
             <w:pPr>
               <w:jc w:val="center"/>
               <w:rPr>
+                <w:rFonts w:ascii="Times New Roman" w:eastAsia="宋体" w:hAnsi="Times New Roman"/>
+                <w:sz w:val="24"/>
+                <w:szCs w:val="22"/>
+              </w:rPr>
+            </w:pPr>
+            <w:r>
+              <w:t>1289</w:t>
+            </w:r>
+          </w:p>
+        </w:tc>
+        <w:tc>
+          <w:tcPr>
+            <w:tcW w:w="0" w:type="auto"/>
+            <w:tcBorders>
+              <w:top w:val="single" w:sz="4" w:space="0" w:color="auto"/>
+              <w:left w:val="single" w:sz="4" w:space="0" w:color="auto"/>
+              <w:bottom w:val="single" w:sz="4" w:space="0" w:color="auto"/>
+              <w:right w:val="single" w:sz="4" w:space="0" w:color="auto"/>
+            </w:tcBorders>
+            <w:vAlign w:val="center"/>
+            <w:hideMark/>
+          </w:tcPr>
+          <w:p>
+            <w:pPr>
+              <w:jc w:val="center"/>
+            </w:pPr>
+            <w:r>
+              <w:t>1102</w:t>
+            </w:r>
+          </w:p>
+        </w:tc>
+      </w:tr>
+      <w:tr>
+        <w:tc>
+          <w:tcPr>
+            <w:tcW w:w="0" w:type="auto"/>
+            <w:tcBorders>
+              <w:top w:val="single" w:sz="4" w:space="0" w:color="auto"/>
+              <w:left w:val="single" w:sz="4" w:space="0" w:color="auto"/>
+              <w:bottom w:val="single" w:sz="4" w:space="0" w:color="auto"/>
+              <w:right w:val="single" w:sz="4" w:space="0" w:color="auto"/>
+            </w:tcBorders>
+            <w:vAlign w:val="center"/>
+            <w:hideMark/>
+          </w:tcPr>
+          <w:p>
+            <w:pPr>
+              <w:jc w:val="center"/>
+            </w:pPr>
+            <w:proofErr w:type="spellStart"/>
+            <w:r>
+              <w:t>LLaMA</w:t>
+            </w:r>
+            <w:proofErr w:type="spellEnd"/>
+            <w:r>
+              <w:rPr>
+                <w:rFonts w:hint="eastAsia"/>
+              </w:rPr>
+              <w:t>（</w:t>
+            </w:r>
+            <w:r>
+              <w:t xml:space="preserve">3 </w:t>
+            </w:r>
+            <w:r>
+              <w:rPr>
+                <w:rFonts w:hint="eastAsia"/>
+              </w:rPr>
+              <w:t>程序）</w:t>
+            </w:r>
+          </w:p>
+        </w:tc>
+        <w:tc>
+          <w:tcPr>
+            <w:tcW w:w="0" w:type="auto"/>
+            <w:tcBorders>
+              <w:top w:val="single" w:sz="4" w:space="0" w:color="auto"/>
+              <w:left w:val="single" w:sz="4" w:space="0" w:color="auto"/>
+              <w:bottom w:val="single" w:sz="4" w:space="0" w:color="auto"/>
+              <w:right w:val="single" w:sz="4" w:space="0" w:color="auto"/>
+            </w:tcBorders>
+            <w:vAlign w:val="center"/>
+            <w:hideMark/>
+          </w:tcPr>
+          <w:p>
+            <w:pPr>
+              <w:jc w:val="center"/>
+            </w:pPr>
+            <w:r>
+              <w:rPr>
+                <w:rFonts w:hint="eastAsia"/>
+              </w:rPr>
+              <w:t>1566</w:t>
+            </w:r>
+          </w:p>
+        </w:tc>
+        <w:tc>
+          <w:tcPr>
+            <w:tcW w:w="0" w:type="auto"/>
+            <w:tcBorders>
+              <w:top w:val="single" w:sz="4" w:space="0" w:color="auto"/>
+              <w:left w:val="single" w:sz="4" w:space="0" w:color="auto"/>
+              <w:bottom w:val="single" w:sz="4" w:space="0" w:color="auto"/>
+              <w:right w:val="single" w:sz="4" w:space="0" w:color="auto"/>
+            </w:tcBorders>
+            <w:vAlign w:val="center"/>
+            <w:hideMark/>
+          </w:tcPr>
+          <w:p>
+            <w:pPr>
+              <w:rPr>
                 <w:rFonts w:ascii="DengXian" w:eastAsia="DengXian" w:hAnsi="DengXian"/>
+                <w:kern w:val="0"/>
                 <w:sz w:val="20"/>
                 <w:szCs w:val="20"/>
               </w:rPr>
             </w:pPr>
-          </w:p>
-        </w:tc>
-        <w:tc>
-          <w:tcPr>
-            <w:tcW w:w="0" w:type="auto"/>
-            <w:tcBorders>
-              <w:top w:val="single" w:sz="4" w:space="0" w:color="auto"/>
-              <w:left w:val="single" w:sz="4" w:space="0" w:color="auto"/>
-              <w:bottom w:val="single" w:sz="4" w:space="0" w:color="auto"/>
-              <w:right w:val="single" w:sz="4" w:space="0" w:color="auto"/>
-            </w:tcBorders>
-            <w:vAlign w:val="center"/>
-            <w:hideMark/>
-          </w:tcPr>
-          <w:p>
-            <w:pPr>
-              <w:jc w:val="center"/>
-              <w:rPr>
-                <w:rFonts w:ascii="Times New Roman" w:eastAsia="宋体" w:hAnsi="Times New Roman" w:hint="eastAsia"/>
-                <w:sz w:val="24"/>
-                <w:szCs w:val="22"/>
-              </w:rPr>
-            </w:pPr>
-            <w:r>
-              <w:t>12</w:t>
-            </w:r>
-            <w:r>
-              <w:rPr>
-                <w:rFonts w:hint="eastAsia"/>
-              </w:rPr>
-              <w:t>52</w:t>
-            </w:r>
-          </w:p>
-        </w:tc>
-        <w:tc>
-          <w:tcPr>
-            <w:tcW w:w="0" w:type="auto"/>
-            <w:tcBorders>
-              <w:top w:val="single" w:sz="4" w:space="0" w:color="auto"/>
-              <w:left w:val="single" w:sz="4" w:space="0" w:color="auto"/>
-              <w:bottom w:val="single" w:sz="4" w:space="0" w:color="auto"/>
-              <w:right w:val="single" w:sz="4" w:space="0" w:color="auto"/>
-            </w:tcBorders>
-            <w:vAlign w:val="center"/>
-            <w:hideMark/>
-          </w:tcPr>
-          <w:p>
-            <w:pPr>
-              <w:jc w:val="center"/>
-              <w:rPr>
-                <w:rFonts w:hint="eastAsia"/>
-              </w:rPr>
-            </w:pPr>
-            <w:r>
-              <w:t>110</w:t>
-            </w:r>
-            <w:r>
-              <w:rPr>
-                <w:rFonts w:hint="eastAsia"/>
-              </w:rPr>
-              <w:t>6</w:t>
-            </w:r>
-          </w:p>
-        </w:tc>
-      </w:tr>
-      <w:tr>
-        <w:tc>
-          <w:tcPr>
-            <w:tcW w:w="0" w:type="auto"/>
-            <w:tcBorders>
-              <w:top w:val="single" w:sz="4" w:space="0" w:color="auto"/>
-              <w:left w:val="single" w:sz="4" w:space="0" w:color="auto"/>
-              <w:bottom w:val="single" w:sz="4" w:space="0" w:color="auto"/>
-              <w:right w:val="single" w:sz="4" w:space="0" w:color="auto"/>
-            </w:tcBorders>
-            <w:vAlign w:val="center"/>
-            <w:hideMark/>
-          </w:tcPr>
-          <w:p>
-            <w:pPr>
-              <w:jc w:val="center"/>
-            </w:pPr>
-            <w:r>
-              <w:t>SD-</w:t>
-            </w:r>
-            <w:proofErr w:type="spellStart"/>
-            <w:r>
-              <w:t>UNet</w:t>
-            </w:r>
-            <w:proofErr w:type="spellEnd"/>
-            <w:r>
-              <w:rPr>
-                <w:rFonts w:hint="eastAsia"/>
-              </w:rPr>
-              <w:t>（</w:t>
-            </w:r>
-            <w:r>
-              <w:t xml:space="preserve">5 </w:t>
-            </w:r>
-            <w:r>
-              <w:rPr>
-                <w:rFonts w:hint="eastAsia"/>
-              </w:rPr>
-              <w:t>程序）</w:t>
-            </w:r>
-          </w:p>
-        </w:tc>
-        <w:tc>
-          <w:tcPr>
-            <w:tcW w:w="0" w:type="auto"/>
-            <w:tcBorders>
-              <w:top w:val="single" w:sz="4" w:space="0" w:color="auto"/>
-              <w:left w:val="single" w:sz="4" w:space="0" w:color="auto"/>
-              <w:bottom w:val="single" w:sz="4" w:space="0" w:color="auto"/>
-              <w:right w:val="single" w:sz="4" w:space="0" w:color="auto"/>
-            </w:tcBorders>
-            <w:vAlign w:val="center"/>
-            <w:hideMark/>
-          </w:tcPr>
-          <w:p>
-            <w:pPr>
-              <w:jc w:val="center"/>
-              <w:rPr>
-                <w:rFonts w:hint="eastAsia"/>
-              </w:rPr>
-            </w:pPr>
-            <w:r>
-              <w:rPr>
-                <w:rFonts w:hint="eastAsia"/>
-              </w:rPr>
-              <w:t>1563</w:t>
-            </w:r>
-          </w:p>
-        </w:tc>
-        <w:tc>
-          <w:tcPr>
-            <w:tcW w:w="0" w:type="auto"/>
-            <w:tcBorders>
-              <w:top w:val="single" w:sz="4" w:space="0" w:color="auto"/>
-              <w:left w:val="single" w:sz="4" w:space="0" w:color="auto"/>
-              <w:bottom w:val="single" w:sz="4" w:space="0" w:color="auto"/>
-              <w:right w:val="single" w:sz="4" w:space="0" w:color="auto"/>
-            </w:tcBorders>
-            <w:vAlign w:val="center"/>
-            <w:hideMark/>
-          </w:tcPr>
-          <w:p>
-            <w:pPr>
-              <w:ind w:hanging="720"/>
-              <w:jc w:val="center"/>
+            <w:r>
               <w:rPr>
                 <w:rFonts w:ascii="DengXian" w:eastAsia="DengXian" w:hAnsi="DengXian" w:hint="eastAsia"/>
                 <w:kern w:val="0"/>
                 <w:sz w:val="20"/>
                 <w:szCs w:val="20"/>
               </w:rPr>
-            </w:pPr>
-            <w:r>
-              <w:rPr>
-                <w:rFonts w:ascii="DengXian" w:eastAsia="DengXian" w:hAnsi="DengXian" w:hint="eastAsia"/>
-                <w:kern w:val="0"/>
+              <w:t>1446</w:t>
+            </w:r>
+          </w:p>
+          <w:p>
+            <w:pPr>
+              <w:jc w:val="center"/>
+              <w:rPr>
+                <w:rFonts w:ascii="DengXian" w:eastAsia="DengXian" w:hAnsi="DengXian"/>
                 <w:sz w:val="20"/>
                 <w:szCs w:val="20"/>
               </w:rPr>
-              <w:t>1459</w:t>
-            </w:r>
+            </w:pPr>
           </w:p>
         </w:tc>
         <w:tc>
@@ -7122,7 +8134,10 @@
               </w:rPr>
             </w:pPr>
             <w:r>
-              <w:t>1289</w:t>
+              <w:rPr>
+                <w:rFonts w:hint="eastAsia"/>
+              </w:rPr>
+              <w:t>1290</w:t>
             </w:r>
           </w:p>
         </w:tc>
@@ -7141,168 +8156,6 @@
           <w:p>
             <w:pPr>
               <w:jc w:val="center"/>
-            </w:pPr>
-            <w:r>
-              <w:t>1102</w:t>
-            </w:r>
-          </w:p>
-        </w:tc>
-      </w:tr>
-      <w:tr>
-        <w:tc>
-          <w:tcPr>
-            <w:tcW w:w="0" w:type="auto"/>
-            <w:tcBorders>
-              <w:top w:val="single" w:sz="4" w:space="0" w:color="auto"/>
-              <w:left w:val="single" w:sz="4" w:space="0" w:color="auto"/>
-              <w:bottom w:val="single" w:sz="4" w:space="0" w:color="auto"/>
-              <w:right w:val="single" w:sz="4" w:space="0" w:color="auto"/>
-            </w:tcBorders>
-            <w:vAlign w:val="center"/>
-            <w:hideMark/>
-          </w:tcPr>
-          <w:p>
-            <w:pPr>
-              <w:jc w:val="center"/>
-            </w:pPr>
-            <w:proofErr w:type="spellStart"/>
-            <w:r>
-              <w:t>LLaMA</w:t>
-            </w:r>
-            <w:proofErr w:type="spellEnd"/>
-            <w:r>
-              <w:rPr>
-                <w:rFonts w:hint="eastAsia"/>
-              </w:rPr>
-              <w:t>（</w:t>
-            </w:r>
-            <w:r>
-              <w:t xml:space="preserve">3 </w:t>
-            </w:r>
-            <w:r>
-              <w:rPr>
-                <w:rFonts w:hint="eastAsia"/>
-              </w:rPr>
-              <w:t>程序）</w:t>
-            </w:r>
-          </w:p>
-        </w:tc>
-        <w:tc>
-          <w:tcPr>
-            <w:tcW w:w="0" w:type="auto"/>
-            <w:tcBorders>
-              <w:top w:val="single" w:sz="4" w:space="0" w:color="auto"/>
-              <w:left w:val="single" w:sz="4" w:space="0" w:color="auto"/>
-              <w:bottom w:val="single" w:sz="4" w:space="0" w:color="auto"/>
-              <w:right w:val="single" w:sz="4" w:space="0" w:color="auto"/>
-            </w:tcBorders>
-            <w:vAlign w:val="center"/>
-            <w:hideMark/>
-          </w:tcPr>
-          <w:p>
-            <w:pPr>
-              <w:jc w:val="center"/>
-              <w:rPr>
-                <w:rFonts w:hint="eastAsia"/>
-              </w:rPr>
-            </w:pPr>
-            <w:r>
-              <w:rPr>
-                <w:rFonts w:hint="eastAsia"/>
-              </w:rPr>
-              <w:t>1566</w:t>
-            </w:r>
-          </w:p>
-        </w:tc>
-        <w:tc>
-          <w:tcPr>
-            <w:tcW w:w="0" w:type="auto"/>
-            <w:tcBorders>
-              <w:top w:val="single" w:sz="4" w:space="0" w:color="auto"/>
-              <w:left w:val="single" w:sz="4" w:space="0" w:color="auto"/>
-              <w:bottom w:val="single" w:sz="4" w:space="0" w:color="auto"/>
-              <w:right w:val="single" w:sz="4" w:space="0" w:color="auto"/>
-            </w:tcBorders>
-            <w:vAlign w:val="center"/>
-            <w:hideMark/>
-          </w:tcPr>
-          <w:p>
-            <w:pPr>
-              <w:rPr>
-                <w:rFonts w:ascii="DengXian" w:eastAsia="DengXian" w:hAnsi="DengXian" w:hint="eastAsia"/>
-                <w:kern w:val="0"/>
-                <w:sz w:val="20"/>
-                <w:szCs w:val="20"/>
-              </w:rPr>
-            </w:pPr>
-            <w:r>
-              <w:rPr>
-                <w:rFonts w:ascii="DengXian" w:eastAsia="DengXian" w:hAnsi="DengXian" w:hint="eastAsia"/>
-                <w:kern w:val="0"/>
-                <w:sz w:val="20"/>
-                <w:szCs w:val="20"/>
-              </w:rPr>
-              <w:t>1446</w:t>
-            </w:r>
-          </w:p>
-          <w:p>
-            <w:pPr>
-              <w:jc w:val="center"/>
-              <w:rPr>
-                <w:rFonts w:ascii="DengXian" w:eastAsia="DengXian" w:hAnsi="DengXian"/>
-                <w:sz w:val="20"/>
-                <w:szCs w:val="20"/>
-              </w:rPr>
-            </w:pPr>
-          </w:p>
-        </w:tc>
-        <w:tc>
-          <w:tcPr>
-            <w:tcW w:w="0" w:type="auto"/>
-            <w:tcBorders>
-              <w:top w:val="single" w:sz="4" w:space="0" w:color="auto"/>
-              <w:left w:val="single" w:sz="4" w:space="0" w:color="auto"/>
-              <w:bottom w:val="single" w:sz="4" w:space="0" w:color="auto"/>
-              <w:right w:val="single" w:sz="4" w:space="0" w:color="auto"/>
-            </w:tcBorders>
-            <w:vAlign w:val="center"/>
-            <w:hideMark/>
-          </w:tcPr>
-          <w:p>
-            <w:pPr>
-              <w:jc w:val="center"/>
-              <w:rPr>
-                <w:rFonts w:ascii="Times New Roman" w:eastAsia="宋体" w:hAnsi="Times New Roman" w:hint="eastAsia"/>
-                <w:sz w:val="24"/>
-                <w:szCs w:val="22"/>
-              </w:rPr>
-            </w:pPr>
-            <w:r>
-              <w:rPr>
-                <w:rFonts w:hint="eastAsia"/>
-              </w:rPr>
-              <w:t>1290</w:t>
-            </w:r>
-          </w:p>
-        </w:tc>
-        <w:tc>
-          <w:tcPr>
-            <w:tcW w:w="0" w:type="auto"/>
-            <w:tcBorders>
-              <w:top w:val="single" w:sz="4" w:space="0" w:color="auto"/>
-              <w:left w:val="single" w:sz="4" w:space="0" w:color="auto"/>
-              <w:bottom w:val="single" w:sz="4" w:space="0" w:color="auto"/>
-              <w:right w:val="single" w:sz="4" w:space="0" w:color="auto"/>
-            </w:tcBorders>
-            <w:vAlign w:val="center"/>
-            <w:hideMark/>
-          </w:tcPr>
-          <w:p>
-            <w:pPr>
-              <w:jc w:val="center"/>
-              <w:rPr>
-                <w:rFonts w:hint="eastAsia"/>
-              </w:rPr>
             </w:pPr>
             <w:r>
               <w:rPr>
@@ -7320,13 +8173,7 @@
         <w:jc w:val="both"/>
       </w:pPr>
     </w:p>
-    <w:p>
-      <w:pPr>
-        <w:rPr>
-          <w:rFonts w:hint="eastAsia"/>
-        </w:rPr>
-      </w:pPr>
-    </w:p>
+    <w:p/>
     <w:sectPr>
       <w:pgSz w:w="11906" w:h="16838"/>
       <w:pgMar w:top="1440" w:right="1800" w:bottom="1440" w:left="1800" w:header="851" w:footer="992" w:gutter="0"/>
@@ -9013,6 +9860,7 @@
   <w:style w:type="character" w:default="1" w:styleId="a0">
     <w:name w:val="Default Paragraph Font"/>
     <w:uiPriority w:val="1"/>
+    <w:semiHidden/>
     <w:unhideWhenUsed/>
   </w:style>
   <w:style w:type="table" w:default="1" w:styleId="a1">

</xml_diff>